<commit_message>
Koło międzywydziałowe: wiodący W4N, drugi Wydział Mechaniczny
- statut.md: koło międzywydziałowe przy Wydziale Informatyki
  i Telekomunikacji (wiodący, siedziba w Katedrze Sztucznej
  Inteligencji) i Wydziale Mechanicznym (prace w Laboratorium
  Mechatroniki i Robotyki); członkowie ze wszystkich wydziałów; mienie
  przypisane do wydziału, który je udostępnił; cele obejmują roboty
  czworonożne i humanoidalne.
- decyzje.md: wpis zmieniający poprzednią decyzję (bez kasowania).
- dokumenty/: deklaracja, protokół, druga zgoda wydziału (W4N), zgody
  opiekunów z dopiskiem o kole międzywydziałowym; DOCX wygenerowane
  ponownie.
- docs/: koła międzywydziałowe na PWr (rejestracja-kola.md), prace
  kolektywu nad humanoidem (machinekind.md).

Co-Authored-By: Claude Opus 5.5 <noreply@anthropic.com>
</commit_message>
<xml_diff>
--- a/kolo-naukowe/dokumenty/do-druku/deklaracja-zalozycielska.docx
+++ b/kolo-naukowe/dokumenty/do-druku/deklaracja-zalozycielska.docx
@@ -26,13 +26,14 @@
     </w:p>
     <w:p>
       <w:pPr>
-        <w:jc w:val="center"/>
+        <w:spacing w:after="80"/>
+        <w:ind w:left="0"/>
       </w:pPr>
       <w:r>
         <w:rPr>
           <w:b/>
         </w:rPr>
-        <w:t>przy Wydziale Mechanicznym Politechniki Wrocławskiej</w:t>
+        <w:t>międzywydziałowego, przy Wydziale Informatyki i Telekomunikacji oraz Wydziale Mechanicznym Politechniki Wrocławskiej</w:t>
       </w:r>
     </w:p>
     <w:p>
@@ -74,7 +75,7 @@
         <w:t>Cel działania.</w:t>
       </w:r>
       <w:r>
-        <w:t xml:space="preserve"> Koło rozwija physical AI, czyli inteligencję działającą w fizycznym świecie, na prawdziwym sprzęcie, i prowadzi badania z tego zakresu: lokomocję uczoną w symulacji i przenoszoną na maszynę, modele świata i modele wizyjno-językowe, robotykę kroczącą, konstrukcję i napędy maszyn. Koło pracuje w krótkich iteracjach zakończonych działającym wynikiem i współpracuje z kolektywem Machinekind.</w:t>
+        <w:t xml:space="preserve"> Koło rozwija physical AI, czyli inteligencję działającą w fizycznym świecie, na prawdziwym sprzęcie, i prowadzi badania z tego zakresu: lokomocję uczoną w symulacji i przenoszoną na maszynę, modele świata i modele wizyjno-językowe, roboty kroczące, w tym czworonożne i humanoidalne, konstrukcję i napędy maszyn. Koło pracuje w krótkich iteracjach zakończonych działającym wynikiem i współpracuje z kolektywem Machinekind.</w:t>
       </w:r>
     </w:p>
     <w:p>
@@ -89,7 +90,7 @@
         <w:t>Jednostka.</w:t>
       </w:r>
       <w:r>
-        <w:t xml:space="preserve"> Koło będzie działać przy Wydziale Mechanicznym Politechniki Wrocławskiej, z siedzibą w Laboratorium Mechatroniki i Robotyki.</w:t>
+        <w:t xml:space="preserve"> Koło będzie międzywydziałowym kołem naukowym działającym przy Wydziale Informatyki i Telekomunikacji (wydział wiodący, siedziba w Katedrze Sztucznej Inteligencji) oraz przy Wydziale Mechanicznym (Laboratorium Mechatroniki i Robotyki) Politechniki Wrocławskiej.</w:t>
       </w:r>
     </w:p>
     <w:p>
@@ -104,7 +105,7 @@
         <w:t>Opiekunowie naukowi.</w:t>
       </w:r>
       <w:r>
-        <w:t xml:space="preserve"> dr hab. inż. Jarosław Szrek, prof. uczelni, oraz dr hab. inż. Tomasz Kajdanowicz.</w:t>
+        <w:t xml:space="preserve"> dr hab. inż. Tomasz Kajdanowicz oraz dr hab. inż. Jarosław Szrek, prof. uczelni.</w:t>
       </w:r>
     </w:p>
     <w:p>

</xml_diff>

<commit_message>
Regulamin: cele physical AI, przedsiębiorczość i badania naukowe
- statut.md § 2: trzy główne cele: rozwój zdolności w kierunku physical
  AI; rozwój przedsiębiorczości (zespoły startupowe, wspieranie startupów
  członków, łączenie z funduszami inwestycyjnymi i venture builderami);
  badania naukowe.
- § 3: dzień demonstracyjny dla inwestorów, warsztaty i mentoring
  startupowy, akceleratory.
- § 13 ust. 5–9: startupy poza kołem, koło nie obejmuje udziałów i nie
  pośredniczy w inwestycjach, zgody uczelni, ujawnianie konfliktu
  interesów.
- Deklaracja założycielska i README koła zgodne z nowymi celami; DOCX
  wygenerowane ponownie.

Co-Authored-By: Claude Opus 5.5 <noreply@anthropic.com>
</commit_message>
<xml_diff>
--- a/kolo-naukowe/dokumenty/do-druku/deklaracja-zalozycielska.docx
+++ b/kolo-naukowe/dokumenty/do-druku/deklaracja-zalozycielska.docx
@@ -72,10 +72,10 @@
         <w:rPr>
           <w:b/>
         </w:rPr>
-        <w:t>Cel działania.</w:t>
+        <w:t>Cele działania.</w:t>
       </w:r>
       <w:r>
-        <w:t xml:space="preserve"> Koło rozwija physical AI, czyli inteligencję działającą w fizycznym świecie, na prawdziwym sprzęcie, i prowadzi badania z tego zakresu: lokomocję uczoną w symulacji i przenoszoną na maszynę, modele świata i modele wizyjno-językowe, roboty kroczące, w tym czworonożne i humanoidalne, konstrukcję i napędy maszyn. Koło pracuje w krótkich iteracjach zakończonych działającym wynikiem i współpracuje z kolektywem Machinekind.</w:t>
+        <w:t xml:space="preserve"> Rozwój zdolności członków w kierunku physical AI, czyli inteligencji działającej w fizycznym świecie, na prawdziwym sprzęcie; rozwój przedsiębiorczości technologicznej przez tworzenie zespołów startupowych, wspieranie startupów członków i łączenie ich z funduszami inwestycyjnymi i venture builderami; prowadzenie badań naukowych z zakresu physical AI. Koło współpracuje z kolektywem Machinekind.</w:t>
       </w:r>
     </w:p>
     <w:p>

</xml_diff>